<commit_message>
CSA vliw 1st v
</commit_message>
<xml_diff>
--- a/Computation math/Comp_lab_6/Выч Мат ЛР6 P3215  Линейский А.Е..docx
+++ b/Computation math/Comp_lab_6/Выч Мат ЛР6 P3215  Линейский А.Е..docx
@@ -356,11 +356,11 @@
         <w:t>6</w:t>
       </w:r>
     </w:p>
-    <w:bookmarkStart w:id="0" w:name="_Toc231489757" w:displacedByCustomXml="next"/>
-    <w:bookmarkStart w:id="1" w:name="_Toc178447396" w:displacedByCustomXml="next"/>
+    <w:bookmarkStart w:id="0" w:name="_Toc182062724" w:displacedByCustomXml="next"/>
+    <w:bookmarkStart w:id="1" w:name="_Toc178448935" w:displacedByCustomXml="next"/>
     <w:bookmarkStart w:id="2" w:name="_Toc178448813" w:displacedByCustomXml="next"/>
-    <w:bookmarkStart w:id="3" w:name="_Toc178448935" w:displacedByCustomXml="next"/>
-    <w:bookmarkStart w:id="4" w:name="_Toc182062724" w:displacedByCustomXml="next"/>
+    <w:bookmarkStart w:id="3" w:name="_Toc178447396" w:displacedByCustomXml="next"/>
+    <w:bookmarkStart w:id="4" w:name="_Toc231489757" w:displacedByCustomXml="next"/>
     <w:sdt>
       <w:sdtPr>
         <w:rPr>
@@ -2343,10 +2343,7 @@
       </w:pPr>
       <w:bookmarkStart w:id="10" w:name="_Toc231489763"/>
       <w:r>
-        <w:t xml:space="preserve">Метод </w:t>
-      </w:r>
-      <w:r>
-        <w:t>Рунге-Кутты 4-го порядка</w:t>
+        <w:t>Метод Рунге-Кутты 4-го порядка</w:t>
       </w:r>
       <w:bookmarkEnd w:id="10"/>
     </w:p>
@@ -3288,21 +3285,7 @@
                   <w:rFonts w:ascii="Cambria Math" w:hAnsi="Cambria Math"/>
                   <w:lang w:val="en-US"/>
                 </w:rPr>
-                <m:t>+</m:t>
-              </m:r>
-              <m:r>
-                <w:rPr>
-                  <w:rFonts w:ascii="Cambria Math" w:hAnsi="Cambria Math"/>
-                  <w:lang w:val="en-US"/>
-                </w:rPr>
-                <m:t>h</m:t>
-              </m:r>
-              <m:r>
-                <w:rPr>
-                  <w:rFonts w:ascii="Cambria Math" w:hAnsi="Cambria Math"/>
-                  <w:lang w:val="en-US"/>
-                </w:rPr>
-                <m:t xml:space="preserve">, </m:t>
+                <m:t xml:space="preserve">+h, </m:t>
               </m:r>
               <m:sSub>
                 <m:sSubPr>
@@ -3338,14 +3321,7 @@
                   <w:rFonts w:ascii="Cambria Math" w:hAnsi="Cambria Math"/>
                   <w:lang w:val="en-US"/>
                 </w:rPr>
-                <m:t>+</m:t>
-              </m:r>
-              <m:r>
-                <w:rPr>
-                  <w:rFonts w:ascii="Cambria Math" w:hAnsi="Cambria Math"/>
-                  <w:lang w:val="en-US"/>
-                </w:rPr>
-                <m:t>h</m:t>
+                <m:t>+h</m:t>
               </m:r>
               <m:sSub>
                 <m:sSubPr>
@@ -3396,10 +3372,7 @@
       </w:pPr>
       <w:bookmarkStart w:id="11" w:name="_Toc231489764"/>
       <w:r>
-        <w:t xml:space="preserve">Метод </w:t>
-      </w:r>
-      <w:r>
-        <w:t>Адамса</w:t>
+        <w:t>Метод Адамса</w:t>
       </w:r>
       <w:bookmarkEnd w:id="11"/>
     </w:p>
@@ -4137,6 +4110,9 @@
         <w:ind w:firstLine="0"/>
       </w:pPr>
       <w:r>
+        <w:rPr>
+          <w:noProof/>
+        </w:rPr>
         <w:drawing>
           <wp:inline distT="0" distB="0" distL="0" distR="0" wp14:anchorId="158C1666" wp14:editId="6DFB2FAA">
             <wp:extent cx="5939790" cy="3081020"/>
@@ -4180,6 +4156,9 @@
         <w:jc w:val="center"/>
       </w:pPr>
       <w:r>
+        <w:rPr>
+          <w:noProof/>
+        </w:rPr>
         <w:drawing>
           <wp:inline distT="0" distB="0" distL="0" distR="0" wp14:anchorId="3D018613" wp14:editId="412AFBCF">
             <wp:extent cx="5939790" cy="3818890"/>
@@ -4232,6 +4211,9 @@
         <w:ind w:firstLine="0"/>
       </w:pPr>
       <w:r>
+        <w:rPr>
+          <w:noProof/>
+        </w:rPr>
         <w:lastRenderedPageBreak/>
         <w:drawing>
           <wp:inline distT="0" distB="0" distL="0" distR="0" wp14:anchorId="344362B7" wp14:editId="51D7E0F6">
@@ -8599,6 +8581,7 @@
   <w:style w:type="character" w:default="1" w:styleId="a1">
     <w:name w:val="Default Paragraph Font"/>
     <w:uiPriority w:val="1"/>
+    <w:semiHidden/>
     <w:unhideWhenUsed/>
   </w:style>
   <w:style w:type="table" w:default="1" w:styleId="a2">

</xml_diff>